<commit_message>
Capture Ideogram (watch + 4.0 open-weight frontier) · 2026-06-18
</commit_message>
<xml_diff>
--- a/weekly_highlights_2026-06-16.docx
+++ b/weekly_highlights_2026-06-16.docx
@@ -20,7 +20,7 @@
           <w:color w:val="57606A"/>
           <w:sz w:val="20"/>
         </w:rPr>
-        <w:t>Tech breakthroughs tracker · as of 2026-06-16 · 16 breakthroughs · 14 weekly entries</w:t>
+        <w:t>Tech breakthroughs tracker · as of 2026-06-16 · 16 breakthroughs · 15 weekly entries</w:t>
       </w:r>
     </w:p>
     <w:p/>
@@ -49,7 +49,7 @@
         <w:rPr>
           <w:i/>
         </w:rPr>
-        <w:t>Generated 2026-06-16T21:28:36</w:t>
+        <w:t>Generated 2026-06-18T21:14:25</w:t>
       </w:r>
     </w:p>
     <w:p>
@@ -57,7 +57,7 @@
         <w:rPr>
           <w:sz w:val="22"/>
         </w:rPr>
-        <w:t>Ad-hoc placement of two Transformer Lab items: the fused-INT8 diffusion-kernel paper (a quantization/efficiency result on consumer GPUs) and Transformer Lab itself (lab.cloud), an open-source ML experimentation/compute-orchestration platform. Both multi-labelled into existing categories.</w:t>
+        <w:t>Capture Ideogram as a tracked text-to-image player (previously only referenced incidentally via the Transformer Lab kernel paper): a NEW_WATCH for the company and a NEW_FRONTIER for the Ideogram 4.0 open-weight 9.3B diffusion-transformer release (Jun 3, 2026).</w:t>
       </w:r>
     </w:p>
     <w:p>
@@ -159,6 +159,59 @@
       <w:r>
         <w:rPr>
           <w:b/>
+          <w:color w:val="0E6E6F"/>
+          <w:sz w:val="18"/>
+        </w:rPr>
+        <w:t xml:space="preserve">[New watch pick]  </w:t>
+      </w:r>
+      <w:r>
+        <w:rPr>
+          <w:i/>
+          <w:color w:val="57606A"/>
+          <w:sz w:val="18"/>
+        </w:rPr>
+        <w:t xml:space="preserve">#03 Diffusion models (image + video generation)  </w:t>
+      </w:r>
+    </w:p>
+    <w:p>
+      <w:pPr>
+        <w:spacing w:after="80"/>
+        <w:ind w:left="360"/>
+      </w:pPr>
+      <w:r>
+        <w:rPr>
+          <w:b/>
+        </w:rPr>
+        <w:t>Ideogram — text-to-image player (best-in-class text rendering, open-weight 4.0)</w:t>
+      </w:r>
+      <w:r>
+        <w:t xml:space="preserve"> — </w:t>
+      </w:r>
+      <w:r>
+        <w:t>Ideogram (Toronto, ~70 staff) is a leading text-to-image company known for best-in-class text rendering; it has raised $96.5M over two rounds (incl. a16z) and in Jun 2026 shipped Ideogram 4.0 as an open-weight frontier model. Previously absent from the board's diffusion watch-list alongside Midjourney/Runway/Stability.</w:t>
+      </w:r>
+      <w:r>
+        <w:rPr>
+          <w:color w:val="0969DA"/>
+          <w:sz w:val="16"/>
+        </w:rPr>
+        <w:t xml:space="preserve">  (https://ideogram.ai/news/ideogram-4.0/)</w:t>
+      </w:r>
+      <w:r>
+        <w:rPr>
+          <w:color w:val="0969DA"/>
+          <w:sz w:val="16"/>
+        </w:rPr>
+        <w:t xml:space="preserve">  (https://en.wikipedia.org/wiki/Ideogram_(text-to-image_model))</w:t>
+      </w:r>
+    </w:p>
+    <w:p>
+      <w:pPr>
+        <w:spacing w:after="40"/>
+      </w:pPr>
+      <w:r>
+        <w:rPr>
+          <w:b/>
           <w:color w:val="0969DA"/>
           <w:sz w:val="18"/>
         </w:rPr>
@@ -182,80 +235,20 @@
         <w:rPr>
           <w:b/>
         </w:rPr>
-        <w:t>Fused INT8 Triton kernel runs Ideogram 4.0 (DiT) on a single RTX 3090</w:t>
+        <w:t>Ideogram 4.0: open-weight 9.3B single-stream diffusion transformer</w:t>
       </w:r>
       <w:r>
         <w:t xml:space="preserve"> — </w:t>
       </w:r>
       <w:r>
-        <w:t>Transformer Lab's fused INT8 GEMM kernel realizes native integer-tensor-core compute for a diffusion transformer, taking INT8 from slowest to fastest variant and fitting 1024px generation on one consumer 24GB GPU (~9.5% end-to-end vs FP8, consumer-Ampere only; honest about the ceiling). Paper arXiv 2606.14598.</w:t>
+        <w:t>On Jun 3, 2026 Ideogram released 4.0 — described as the first open-weight text-to-image model trained from scratch at this scale (9.3B single-stream DiT, commercial license), explicitly aiming to close the quality gap between proprietary frontier image models and the open ecosystem.</w:t>
       </w:r>
       <w:r>
         <w:rPr>
           <w:color w:val="0969DA"/>
           <w:sz w:val="16"/>
         </w:rPr>
-        <w:t xml:space="preserve">  (https://arxiv.org/abs/2606.14598)</w:t>
-      </w:r>
-      <w:r>
-        <w:rPr>
-          <w:color w:val="0969DA"/>
-          <w:sz w:val="16"/>
-        </w:rPr>
-        <w:t xml:space="preserve">  (https://x.com/transformerlab/status/2066596062270525732)</w:t>
-      </w:r>
-    </w:p>
-    <w:p>
-      <w:pPr>
-        <w:spacing w:after="40"/>
-      </w:pPr>
-      <w:r>
-        <w:rPr>
-          <w:b/>
-          <w:color w:val="0E6E6F"/>
-          <w:sz w:val="18"/>
-        </w:rPr>
-        <w:t xml:space="preserve">[New watch pick]  </w:t>
-      </w:r>
-      <w:r>
-        <w:rPr>
-          <w:i/>
-          <w:color w:val="57606A"/>
-          <w:sz w:val="18"/>
-        </w:rPr>
-        <w:t xml:space="preserve">#16 AI dev ecosystem &amp; agent primitives (MCP, skills, agents, orchestration)  </w:t>
-      </w:r>
-    </w:p>
-    <w:p>
-      <w:pPr>
-        <w:spacing w:after="80"/>
-        <w:ind w:left="360"/>
-      </w:pPr>
-      <w:r>
-        <w:rPr>
-          <w:b/>
-        </w:rPr>
-        <w:t>Transformer Lab — open-source ML experimentation &amp; compute-orchestration platform</w:t>
-      </w:r>
-      <w:r>
-        <w:t xml:space="preserve"> — </w:t>
-      </w:r>
-      <w:r>
-        <w:t>lab.cloud / Transformer Lab is an open-source platform for ML researchers to request local/cloud compute nodes, submit ML jobs, and track experiments and artifacts in one place; a 'for-teams' tier targets collaborative clusters. Notable for reproducible, honest quantization research (fused INT8 work).</w:t>
-      </w:r>
-      <w:r>
-        <w:rPr>
-          <w:color w:val="0969DA"/>
-          <w:sz w:val="16"/>
-        </w:rPr>
-        <w:t xml:space="preserve">  (https://lab.cloud/for-teams)</w:t>
-      </w:r>
-      <w:r>
-        <w:rPr>
-          <w:color w:val="0969DA"/>
-          <w:sz w:val="16"/>
-        </w:rPr>
-        <w:t xml:space="preserve">  (https://arxiv.org/abs/2606.14598)</w:t>
+        <w:t xml:space="preserve">  (https://ideogram.ai/news/ideogram-4.0/)</w:t>
       </w:r>
     </w:p>
     <w:p>
@@ -276,7 +269,7 @@
         <w:rPr>
           <w:i/>
         </w:rPr>
-        <w:t>All 14 entries (newest first). Each row aggregates the additions logged in state.json for that week.</w:t>
+        <w:t>All 15 entries (newest first). Each row aggregates the additions logged in state.json for that week.</w:t>
       </w:r>
     </w:p>
     <w:tbl>
@@ -357,6 +350,60 @@
                 <w:sz w:val="18"/>
               </w:rPr>
               <w:t>Additions</w:t>
+            </w:r>
+          </w:p>
+        </w:tc>
+      </w:tr>
+      <w:tr>
+        <w:tc>
+          <w:tcPr>
+            <w:tcW w:type="dxa" w:w="1440"/>
+          </w:tcPr>
+          <w:p>
+            <w:r>
+              <w:rPr>
+                <w:sz w:val="18"/>
+              </w:rPr>
+              <w:t>2026-06-16</w:t>
+            </w:r>
+          </w:p>
+        </w:tc>
+        <w:tc>
+          <w:tcPr>
+            <w:tcW w:type="dxa" w:w="1440"/>
+          </w:tcPr>
+          <w:p>
+            <w:r>
+              <w:rPr>
+                <w:sz w:val="18"/>
+              </w:rPr>
+              <w:t>WEEKLY_UPDATE</w:t>
+            </w:r>
+          </w:p>
+        </w:tc>
+        <w:tc>
+          <w:tcPr>
+            <w:tcW w:type="dxa" w:w="4896"/>
+          </w:tcPr>
+          <w:p>
+            <w:r>
+              <w:rPr>
+                <w:sz w:val="18"/>
+              </w:rPr>
+              <w:t>Capture Ideogram as a tracked text-to-image player (previously only referenced incidentally via the Transformer Lab kernel paper): a NEW_WATCH for the company and a NEW_FRONTIER for the Ideogram 4.0 open-weight 9.3B diffusion-transformer release (Jun 3, 2026).</w:t>
+            </w:r>
+          </w:p>
+        </w:tc>
+        <w:tc>
+          <w:tcPr>
+            <w:tcW w:type="dxa" w:w="1584"/>
+          </w:tcPr>
+          <w:p>
+            <w:r>
+              <w:rPr>
+                <w:sz w:val="18"/>
+              </w:rPr>
+              <w:t>+1 frt  +1 wch</w:t>
             </w:r>
           </w:p>
         </w:tc>

</xml_diff>